<commit_message>
Correct WhatsApp number status: confirmed +44 7426 494321 (Griffin), only the website needs fixing
Griffin confirmed the inbox number in the Telegram thread; reframe from
'unresolved mismatch' to 'confirmed, site needs updating' across the docx,
run sheet, CONTEXT.md, and CLAUDE.md.

Co-Authored-By: Claude Opus 4.8 <noreply@anthropic.com>
Claude-Session: https://claude.ai/code/session_01Qk44oiJ6G4KGcJdussGzUo
</commit_message>
<xml_diff>
--- a/outputs/schoeman-clinic/Schoeman-Clinic-GHL-Team-Training-Agenda.docx
+++ b/outputs/schoeman-clinic/Schoeman-Clinic-GHL-Team-Training-Agenda.docx
@@ -654,12 +654,11 @@
       <w:r>
         <w:rPr>
           <w:b/>
-          <w:color w:val="B02A2A"/>
         </w:rPr>
-        <w:t xml:space="preserve">Confirm which number </w:t>
+        <w:t xml:space="preserve">The number </w:t>
       </w:r>
       <w:r>
-        <w:t>is correct: +44 7426 494321 (Griffin’s) vs the website’s +44 7426 292 321. Don’t teach the wrong one.</w:t>
+        <w:t>is confirmed: +44 7426 494321. No team action — just know the website still shows an old number (+44 7426 292 321); flag Mati/Gina to fix the site.</w:t>
       </w:r>
     </w:p>
     <w:p>
@@ -1304,7 +1303,7 @@
               <w:rPr>
                 <w:sz w:val="19"/>
               </w:rPr>
-              <w:t>+44 7426 494321 (confirm before the call). The website shows a different one we’re getting fixed.</w:t>
+              <w:t>+44 7426 494321 (confirmed). The website still shows an old one — we’re getting the site fixed.</w:t>
             </w:r>
           </w:p>
         </w:tc>

</xml_diff>

<commit_message>
Add call-ready HTML run sheet + high-level calendar notes
- training-agenda.html: polished, theme-aware, print-friendly version to open
  live on the call (teal/clinical identity, numbered run-of-show, Q&A table)
- Add 'Calendars — the 60-second version' to HTML, run sheet, and docx:
  WILBA builds the calendars; PAs just keep their linked calendar current
- Matching agenda row + Q&A entry across all three formats

Co-Authored-By: Claude Opus 4.8 <noreply@anthropic.com>
Claude-Session: https://claude.ai/code/session_01Qk44oiJ6G4KGcJdussGzUo
</commit_message>
<xml_diff>
--- a/outputs/schoeman-clinic/Schoeman-Clinic-GHL-Team-Training-Agenda.docx
+++ b/outputs/schoeman-clinic/Schoeman-Clinic-GHL-Team-Training-Agenda.docx
@@ -439,6 +439,59 @@
                 <w:sz w:val="19"/>
               </w:rPr>
               <w:t>Assign, mark unread, hand off across days</w:t>
+            </w:r>
+          </w:p>
+        </w:tc>
+      </w:tr>
+      <w:tr>
+        <w:tc>
+          <w:tcPr>
+            <w:tcW w:type="dxa" w:w="1152"/>
+          </w:tcPr>
+          <w:p>
+            <w:pPr>
+              <w:spacing w:after="20"/>
+            </w:pPr>
+            <w:r>
+              <w:rPr>
+                <w:b/>
+                <w:color w:val="2E5C8A"/>
+                <w:sz w:val="19"/>
+              </w:rPr>
+              <w:t>4 min</w:t>
+            </w:r>
+          </w:p>
+        </w:tc>
+        <w:tc>
+          <w:tcPr>
+            <w:tcW w:type="dxa" w:w="3456"/>
+          </w:tcPr>
+          <w:p>
+            <w:pPr>
+              <w:spacing w:after="20"/>
+            </w:pPr>
+            <w:r>
+              <w:rPr>
+                <w:b/>
+                <w:sz w:val="19"/>
+              </w:rPr>
+              <w:t>Calendars — 60-sec version</w:t>
+            </w:r>
+          </w:p>
+        </w:tc>
+        <w:tc>
+          <w:tcPr>
+            <w:tcW w:type="dxa" w:w="4608"/>
+          </w:tcPr>
+          <w:p>
+            <w:pPr>
+              <w:spacing w:after="20"/>
+            </w:pPr>
+            <w:r>
+              <w:rPr>
+                <w:sz w:val="19"/>
+              </w:rPr>
+              <w:t>Keep your linked calendar current and it just works</w:t>
             </w:r>
           </w:p>
         </w:tc>
@@ -938,6 +991,94 @@
           <w:color w:val="2E5C8A"/>
           <w:sz w:val="21"/>
         </w:rPr>
+        <w:t>5b · Calendars — the 60-second version</w:t>
+      </w:r>
+    </w:p>
+    <w:p>
+      <w:pPr>
+        <w:spacing w:after="120" w:before="0"/>
+      </w:pPr>
+      <w:r>
+        <w:rPr>
+          <w:b w:val="0"/>
+          <w:i/>
+          <w:sz w:val="21"/>
+        </w:rPr>
+        <w:t>Keep this high-level. You are NOT teaching them to build/configure calendars — WILBA sets those up. They only need the one thing that’s on them.</w:t>
+      </w:r>
+    </w:p>
+    <w:p>
+      <w:pPr>
+        <w:pStyle w:val="ListBullet"/>
+        <w:spacing w:after="60"/>
+      </w:pPr>
+      <w:r>
+        <w:rPr>
+          <w:b/>
+        </w:rPr>
+        <w:t xml:space="preserve">WILBA builds </w:t>
+      </w:r>
+      <w:r>
+        <w:t>the clinic calendar (e.g. discovery calls) with set hours. The team does not configure that.</w:t>
+      </w:r>
+    </w:p>
+    <w:p>
+      <w:pPr>
+        <w:pStyle w:val="ListBullet"/>
+        <w:spacing w:after="60"/>
+      </w:pPr>
+      <w:r>
+        <w:rPr>
+          <w:b/>
+        </w:rPr>
+        <w:t xml:space="preserve">Each person is linked </w:t>
+      </w:r>
+      <w:r>
+        <w:t>into it with their own connected calendar. When a patient books, they don’t pick a person — the system offers whoever’s free.</w:t>
+      </w:r>
+    </w:p>
+    <w:p>
+      <w:pPr>
+        <w:pStyle w:val="ListBullet"/>
+        <w:spacing w:after="60"/>
+      </w:pPr>
+      <w:r>
+        <w:rPr>
+          <w:b/>
+        </w:rPr>
+        <w:t xml:space="preserve">Your only job: </w:t>
+      </w:r>
+      <w:r>
+        <w:t>keep your linked calendar up to date — connect it and block out time off / unavailability.</w:t>
+      </w:r>
+    </w:p>
+    <w:p>
+      <w:pPr>
+        <w:pStyle w:val="ListBullet"/>
+        <w:spacing w:after="60"/>
+      </w:pPr>
+      <w:r>
+        <w:rPr>
+          <w:b/>
+          <w:color w:val="B02A2A"/>
+        </w:rPr>
+        <w:t xml:space="preserve">The one takeaway: </w:t>
+      </w:r>
+      <w:r>
+        <w:t>as long as your linked calendar is up to date, availability stays accurate on its own — nothing to manage by hand.</w:t>
+      </w:r>
+    </w:p>
+    <w:p>
+      <w:pPr>
+        <w:spacing w:after="40" w:before="0"/>
+      </w:pPr>
+      <w:r>
+        <w:rPr>
+          <w:b/>
+          <w:i w:val="0"/>
+          <w:color w:val="2E5C8A"/>
+          <w:sz w:val="21"/>
+        </w:rPr>
         <w:t>6 · Escalation basics (this matters at a clinic)</w:t>
       </w:r>
     </w:p>
@@ -1246,6 +1387,35 @@
                 <w:sz w:val="19"/>
               </w:rPr>
               <w:t>Not yet — that’s a later phase, and a human will always approve every AI reply.</w:t>
+            </w:r>
+          </w:p>
+        </w:tc>
+      </w:tr>
+      <w:tr>
+        <w:tc>
+          <w:tcPr>
+            <w:tcW w:type="dxa" w:w="3456"/>
+          </w:tcPr>
+          <w:p>
+            <w:r>
+              <w:rPr>
+                <w:b/>
+                <w:sz w:val="19"/>
+              </w:rPr>
+              <w:t>“Do I need to manage the calendar?”</w:t>
+            </w:r>
+          </w:p>
+        </w:tc>
+        <w:tc>
+          <w:tcPr>
+            <w:tcW w:type="dxa" w:w="5760"/>
+          </w:tcPr>
+          <w:p>
+            <w:r>
+              <w:rPr>
+                <w:sz w:val="19"/>
+              </w:rPr>
+              <w:t>No — just keep your own linked calendar up to date and block out time off. Availability updates on its own.</w:t>
             </w:r>
           </w:p>
         </w:tc>

</xml_diff>